<commit_message>
EE Book 4: new Chapter 41, Power Amplifier Classes Side by Side, and Boosting the Supply on Peaks (A/B/AB/C derivations, D, E design, F/inverse F, J and continuous modes, S, G/H, APT/ET/EER, Doherty and outphasing, comparison of classes, Rayleigh-averaged efficiency, boost and bootstrap supply above the nominal rail on peaks, modulator bandwidth and alignment, DPD, 10 W base-station design); closing section moved from Ch 40; front matter, Ch 1 roadmap and KDP description updated
</commit_message>
<xml_diff>
--- a/EE - Series/RF_Microwave_and_Transceivers_Book4.docx
+++ b/EE - Series/RF_Microwave_and_Transceivers_Book4.docx
@@ -98,7 +98,7 @@
         <w:rPr>
           <w:i w:val="0"/>
         </w:rPr>
-        <w:t>Part II, Chapters 20 to 40, is the active radio. It follows a transmitter from the device to the antenna, through the load line, the amplifier classes, the Doherty amplifier, heat and combining, and then the receiver's noise and dynamic range, the oscillator and the PLL, and radar. Chapters 28 to 40 deepen the chain: the low-noise amplifier, mixers and frequency planning, the link budget, bias and ruggedness, vacuum tubes, RF exposure, transceiver isolation, class E and F design, envelope tracking and outphasing, amplifier measurement, digital predistortion, frequency synthesis, and power detection and control.</w:t>
+        <w:t>Part II, Chapters 20 to 41, is the active radio. It follows a transmitter from the device to the antenna, through the load line, the amplifier classes, the Doherty amplifier, heat and combining, and then the receiver's noise and dynamic range, the oscillator and the PLL, and radar. Chapters 28 to 40 deepen the chain: the low-noise amplifier, mixers and frequency planning, the link budget, bias and ruggedness, vacuum tubes, RF exposure, transceiver isolation, class E and F design, envelope tracking and outphasing, amplifier measurement, digital predistortion, frequency synthesis, and power detection and control. Chapter 41 sets the amplifier classes side by side, from A to S, Doherty, and outphasing, and shows how a supply that tracks the envelope, and rises above its nominal rail on the peaks, raises the average efficiency of any of them.</w:t>
       </w:r>
     </w:p>
     <w:p>
@@ -514,6 +514,15 @@
         <w:rPr>
           <w:i w:val="0"/>
         </w:rPr>
+        <w:t>Chapter 41. Power Amplifier Classes Side by Side, and Boosting the Supply on Peaks</w:t>
+      </w:r>
+    </w:p>
+    <w:p>
+      <w:pPr/>
+      <w:r>
+        <w:rPr>
+          <w:i w:val="0"/>
+        </w:rPr>
         <w:t>Appendix A. Constants and Formulas Used in This Book</w:t>
       </w:r>
     </w:p>
@@ -812,7 +821,7 @@
         <w:rPr>
           <w:i w:val="0"/>
         </w:rPr>
-        <w:t>Chapter 2 develops the transmission line, reflection, and standing waves. Chapters 3 and 4 match one impedance to another, first with lumped components and then with lines and the Smith chart, which Book 1 introduced and this book uses as a working tool. Chapter 5 describes networks by their scattering parameters, the language of every RF datasheet and network analyzer. Chapter 6 builds resonators, filters, and waveguide. Chapter 7 treats the antenna, and Chapter 8 the array and the millimeter-wave link. Chapters 9 to 19 extend the toolkit: couplers, dividers, and hybrids; microstrip and stripline design; broadband matching and the Bode-Fano limit; cavities and dielectric resonators; small antennas, monopoles, loops, and horns; propagation beyond free space; ferrites, circulators, and isolators; antenna measurement; noise in passive networks; a bandpass filter carried from specification to layout; and RF switches. Part II, Chapters 20 to 40, turns to the active radio: amplifiers, receivers, oscillators, synthesizers, and the measurements that prove them. Transmitter power, power-amplifier design, and receiver noise belong to Part II; laminate properties at 10 GHz, the package, and emissions limits belong to Book 7. This book supplies the passive structure that connects them, and it owns the antenna gains that every link budget in the series uses.</w:t>
+        <w:t>Chapter 2 develops the transmission line, reflection, and standing waves. Chapters 3 and 4 match one impedance to another, first with lumped components and then with lines and the Smith chart, which Book 1 introduced and this book uses as a working tool. Chapter 5 describes networks by their scattering parameters, the language of every RF datasheet and network analyzer. Chapter 6 builds resonators, filters, and waveguide. Chapter 7 treats the antenna, and Chapter 8 the array and the millimeter-wave link. Chapters 9 to 19 extend the toolkit: couplers, dividers, and hybrids; microstrip and stripline design; broadband matching and the Bode-Fano limit; cavities and dielectric resonators; small antennas, monopoles, loops, and horns; propagation beyond free space; ferrites, circulators, and isolators; antenna measurement; noise in passive networks; a bandpass filter carried from specification to layout; and RF switches. Part II, Chapters 20 to 41, turns to the active radio: amplifiers, receivers, oscillators, synthesizers, and the measurements that prove them, ending with the amplifier classes set side by side and a supply that tracks the signal and rises above its rail on the peaks. Transmitter power, power-amplifier design, and receiver noise belong to Part II; laminate properties at 10 GHz, the package, and emissions limits belong to Book 7. This book supplies the passive structure that connects them, and it owns the antenna gains that every link budget in the series uses.</w:t>
       </w:r>
     </w:p>
     <w:p>
@@ -15021,6 +15030,15 @@
       </w:r>
     </w:p>
     <w:p>
+      <w:pPr/>
+      <w:r>
+        <w:rPr>
+          <w:i w:val="0"/>
+        </w:rPr>
+        <w:t>One question remains open from Chapters 22, 23, 35, and 36: how the amplifier classes compare when they are set side by side, and how far the supply itself can be made to work for efficiency, including rising above its nominal rail on the signal's peaks. Chapter 41 closes the book with that comparison, a complete design, and a look back over the whole radio.</w:t>
+      </w:r>
+    </w:p>
+    <w:p>
       <w:pPr>
         <w:pStyle w:val="Heading2"/>
       </w:pPr>
@@ -15028,16 +15046,1031 @@
         <w:rPr>
           <w:i w:val="0"/>
         </w:rPr>
-        <w:t>40.5 The whole radio</w:t>
-      </w:r>
-    </w:p>
-    <w:p>
-      <w:pPr/>
-      <w:r>
-        <w:rPr>
-          <w:i w:val="0"/>
-        </w:rPr>
-        <w:t>With power control the radio is complete. The transmitter now measures what it sends, the network tells it how much to send, and every decibel it saves after the last amplifier is a decibel it never had to generate. Looking back over the book, a few ideas carried every chapter. A line longer than a small fraction of a wavelength must be matched or it reflects. Every match, filter, and antenna trades bandwidth against loss and size. Every amplifier trades linearity against efficiency, and every receiver trades sensitivity against the strong signals it must survive.</w:t>
+        <w:t>Practice</w:t>
+      </w:r>
+    </w:p>
+    <w:p>
+      <w:pPr/>
+      <w:r>
+        <w:rPr>
+          <w:b/>
+        </w:rPr>
+        <w:t xml:space="preserve">1. </w:t>
+      </w:r>
+      <w:r>
+        <w:rPr>
+          <w:i w:val="0"/>
+        </w:rPr>
+        <w:t>A 33 dBm transmitter uses a 30 dB coupler and a detector whose maximum is 0 dBm. What pad is needed?</w:t>
+      </w:r>
+    </w:p>
+    <w:p>
+      <w:pPr/>
+      <w:r>
+        <w:rPr>
+          <w:b/>
+        </w:rPr>
+        <w:t xml:space="preserve">2. </w:t>
+      </w:r>
+      <w:r>
+        <w:rPr>
+          <w:i w:val="0"/>
+        </w:rPr>
+        <w:t>Find the directivity error bounds for RL + D = 40 dB.</w:t>
+      </w:r>
+    </w:p>
+    <w:p>
+      <w:pPr/>
+      <w:r>
+        <w:rPr>
+          <w:b/>
+        </w:rPr>
+        <w:t xml:space="preserve">3. </w:t>
+      </w:r>
+      <w:r>
+        <w:rPr>
+          <w:i w:val="0"/>
+        </w:rPr>
+        <w:t>What is the handset output range from −40 dBm to 23 dBm?</w:t>
+      </w:r>
+    </w:p>
+    <w:p>
+      <w:pPr/>
+      <w:r>
+        <w:rPr>
+          <w:b/>
+        </w:rPr>
+        <w:t xml:space="preserve">4. </w:t>
+      </w:r>
+      <w:r>
+        <w:rPr>
+          <w:i w:val="0"/>
+        </w:rPr>
+        <w:t>Convert 15 dBm to milliwatts.</w:t>
+      </w:r>
+    </w:p>
+    <w:p>
+      <w:pPr/>
+      <w:r>
+        <w:rPr>
+          <w:b/>
+        </w:rPr>
+        <w:t xml:space="preserve">5. </w:t>
+      </w:r>
+      <w:r>
+        <w:rPr>
+          <w:i w:val="0"/>
+        </w:rPr>
+        <w:t>Why does a peak-responding detector read high for OFDM?</w:t>
+      </w:r>
+    </w:p>
+    <w:p>
+      <w:pPr/>
+      <w:r>
+        <w:rPr>
+          <w:b/>
+        </w:rPr>
+        <w:t xml:space="preserve">6. </w:t>
+      </w:r>
+      <w:r>
+        <w:rPr>
+          <w:i w:val="0"/>
+        </w:rPr>
+        <w:t>What does a log detector's output voltage track?</w:t>
+      </w:r>
+    </w:p>
+    <w:p>
+      <w:pPr>
+        <w:pStyle w:val="Heading1"/>
+      </w:pPr>
+      <w:r>
+        <w:rPr>
+          <w:i w:val="0"/>
+        </w:rPr>
+        <w:t>Chapter 41. Power Amplifier Classes Side by Side, and Boosting the Supply on Peaks</w:t>
+      </w:r>
+    </w:p>
+    <w:p>
+      <w:pPr/>
+      <w:r>
+        <w:rPr>
+          <w:i w:val="0"/>
+        </w:rPr>
+        <w:t>The power amplifier has appeared in pieces. Chapter 22 named the classes and gave the conduction-angle formula, Chapter 23 showed what back-off costs and how the Doherty amplifier recovers it, Chapter 35 designed class E and class F stages, Chapter 36 introduced envelope tracking, polar transmitters, and outphasing, and Chapter 38 linearized the result with digital predistortion. This chapter puts the classes side by side on one map, adds the members of the family that the earlier chapters only named, classes D, inverse F, J, the continuous modes, and S, and then turns to the other half of the efficiency problem: the supply. A transistor's efficiency depends on how close its drain voltage swings to the supply rail, so a supply that follows the signal, switching between rails, tracking the envelope, or rising above its nominal value on the signal's rare peaks, can raise the average efficiency of any class. The chapter ends with a complete design that combines a load, a class, and a boosted, tracking supply, with every number declared.</w:t>
+      </w:r>
+    </w:p>
+    <w:p>
+      <w:pPr>
+        <w:pStyle w:val="Heading2"/>
+      </w:pPr>
+      <w:r>
+        <w:rPr>
+          <w:i w:val="0"/>
+        </w:rPr>
+        <w:t>41.1 The current-source classes and where their efficiency comes from</w:t>
+      </w:r>
+    </w:p>
+    <w:p>
+      <w:pPr/>
+      <w:r>
+        <w:rPr>
+          <w:i w:val="0"/>
+        </w:rPr>
+        <w:t>In classes A, AB, B, and C the transistor acts as a controlled current source, and the class is set by the bias, which fixes the conduction angle α, the part of each cycle during which current flows. The efficiencies follow from two Fourier coefficients of the drain current: its average, which sets the DC power, and its fundamental, which sets the RF power. Take a device whose drain voltage swings by V₁ = VDD around the supply, the full swing allowed by an ideal device with no knee. In class A the current is a full sine of peak Imax about a bias of Imax/2, so IDC = Imax/2 and I₁ = Imax/2. The output power is V₁I₁/2 = VDD Imax/4 and the DC power is VDD Imax/2, an efficiency of exactly 50 %. In class B the current is a half-wave rectified sine of peak Imax. Its average is Imax/π and its fundamental is Imax/2, so the efficiency is (VDD Imax/4)/(VDD Imax/π) = π/4 = 78.5 %. The same fundamental current is delivered from a smaller average current, and that is the whole of class B's advantage. Class C narrows the pulse further, so the average falls faster than the fundamental and the efficiency approaches 100 % as α approaches zero, but the fundamental output falls with it, and the gain falls because a larger drive is needed to reach the same peak current. Chapter 22's formula, repeated below, gives the efficiency for any angle.</w:t>
+      </w:r>
+    </w:p>
+    <w:p>
+      <w:pPr>
+        <w:jc w:val="center"/>
+      </w:pPr>
+      <w:r>
+        <w:rPr>
+          <w:i w:val="0"/>
+        </w:rPr>
+        <w:t>class A: IDC = I₁ = Imax/2, η = 50 %;   class B: IDC = Imax/π, I₁ = Imax/2, η = π/4</w:t>
+      </w:r>
+    </w:p>
+    <w:p>
+      <w:pPr>
+        <w:jc w:val="center"/>
+      </w:pPr>
+      <w:r>
+        <w:rPr>
+          <w:i w:val="0"/>
+        </w:rPr>
+        <w:t>η(α) = (α − sin α) / [4 (sin(α/2) − (α/2) cos(α/2))]</w:t>
+      </w:r>
+    </w:p>
+    <w:p>
+      <w:pPr/>
+      <w:r>
+        <w:rPr>
+          <w:i w:val="0"/>
+        </w:rPr>
+        <w:t>A real device has a knee voltage Vk below which it cannot swing, so V₁ = VDD − Vk and every efficiency above is multiplied by (VDD − Vk)/VDD. For a 28 V gallium nitride device with a 3 V knee that factor is 0.89, so a class B stage reaches at most 70 % before any matching loss. The knee also fixes the optimum load: a class B stage that must deliver P with a swing of VDD − Vk needs Ropt = (VDD − Vk)²/(2P), a relation that returns at the end of this chapter when the supply is allowed to move.</w:t>
+      </w:r>
+    </w:p>
+    <w:p>
+      <w:pPr>
+        <w:jc w:val="center"/>
+      </w:pPr>
+      <w:r>
+        <w:rPr>
+          <w:i w:val="0"/>
+        </w:rPr>
+        <w:t>Ropt = (VDD − Vk)² / (2P),    η_real = η_ideal × (VDD − Vk)/VDD</w:t>
+      </w:r>
+    </w:p>
+    <w:p>
+      <w:pPr>
+        <w:pStyle w:val="Heading2"/>
+      </w:pPr>
+      <w:r>
+        <w:rPr>
+          <w:i w:val="0"/>
+        </w:rPr>
+        <w:t>Worked Example 41.1</w:t>
+      </w:r>
+    </w:p>
+    <w:p>
+      <w:pPr/>
+      <w:r>
+        <w:rPr>
+          <w:b/>
+        </w:rPr>
+        <w:t xml:space="preserve">Problem. </w:t>
+      </w:r>
+      <w:r>
+        <w:rPr>
+          <w:i w:val="0"/>
+        </w:rPr>
+        <w:t>Find the ideal efficiency at a conduction angle of 150°, between class B and the 120° class C of Worked Example 22.2. What efficiency remains for a 28 V device with a 3 V knee?</w:t>
+      </w:r>
+    </w:p>
+    <w:p>
+      <w:pPr/>
+      <w:r>
+        <w:rPr>
+          <w:b/>
+        </w:rPr>
+        <w:t xml:space="preserve">Solution. </w:t>
+      </w:r>
+      <w:r>
+        <w:rPr>
+          <w:i w:val="0"/>
+        </w:rPr>
+        <w:t>α = 150° = 2.618 rad. The numerator is 2.618 − sin 150° = 2.618 − 0.500 = 2.118. In the denominator, sin 75° = 0.9659 and 1.309 × cos 75° = 1.309 × 0.2588 = 0.3388, so 4 × (0.9659 − 0.3388) = 2.508. The efficiency is 2.118/2.508 = 84.4 %. The knee multiplies it by 25/28 = 0.893, leaving 75.4 %, which is about what a well-matched device delivers at saturation before harmonic tuning.</w:t>
+      </w:r>
+    </w:p>
+    <w:p>
+      <w:pPr/>
+      <w:r>
+        <w:rPr>
+          <w:b/>
+        </w:rPr>
+        <w:t xml:space="preserve">Key idea. </w:t>
+      </w:r>
+      <w:r>
+        <w:rPr>
+          <w:i w:val="0"/>
+        </w:rPr>
+        <w:t>In the current-source classes, efficiency comes from delivering the fundamental current with as little average current as possible. Narrowing the conduction angle does that at a cost in power and gain; the knee voltage takes its share from every class.</w:t>
+      </w:r>
+    </w:p>
+    <w:p>
+      <w:pPr>
+        <w:pStyle w:val="Heading2"/>
+      </w:pPr>
+      <w:r>
+        <w:rPr>
+          <w:i w:val="0"/>
+        </w:rPr>
+        <w:t>41.2 Class D: two switches and a filter</w:t>
+      </w:r>
+    </w:p>
+    <w:p>
+      <w:pPr/>
+      <w:r>
+        <w:rPr>
+          <w:i w:val="0"/>
+        </w:rPr>
+        <w:t>A switching amplifier abandons the current source. In voltage-mode class D, two transistors in a half bridge connect the output node alternately to the supply and to ground, producing a square wave, and a series-tuned filter passes only its fundamental to the load. The fundamental of a square wave between 0 and VDD has an amplitude of (2/π)VDD, so the output power into R is (2VDD/π)²/(2R). An ideal switch has either zero voltage or zero current, so the ideal efficiency is 100 %. The real loss comes from the output capacitance of the switches: every cycle the switch node, with capacitance C equal to the two output capacitances in parallel, is charged to VDD through one switch and discharged through the other, dissipating CVDD² per cycle, whatever the on-resistance. That loss grows in proportion to frequency, which is why voltage-mode class D dominates audio and the high-frequency industrial bands, 6.78 and 13.56 MHz, but not microwave amplifiers. Current-mode class D swaps the roles: it is fed through a choke, its output network is a parallel resonator, and its switches turn on and off at zero voltage, so the output capacitance is absorbed into the resonator instead of being discharged, at the cost of a peak voltage of πVDD.</w:t>
+      </w:r>
+    </w:p>
+    <w:p>
+      <w:pPr>
+        <w:jc w:val="center"/>
+      </w:pPr>
+      <w:r>
+        <w:rPr>
+          <w:i w:val="0"/>
+        </w:rPr>
+        <w:t>V₁ = (2/π) VDD,    Pout = (2VDD/π)² / (2R),    P_Coss = C_node VDD² f</w:t>
+      </w:r>
+    </w:p>
+    <w:p>
+      <w:pPr>
+        <w:pStyle w:val="Heading2"/>
+      </w:pPr>
+      <w:r>
+        <w:rPr>
+          <w:i w:val="0"/>
+        </w:rPr>
+        <w:t>Worked Example 41.2</w:t>
+      </w:r>
+    </w:p>
+    <w:p>
+      <w:pPr/>
+      <w:r>
+        <w:rPr>
+          <w:b/>
+        </w:rPr>
+        <w:t xml:space="preserve">Problem. </w:t>
+      </w:r>
+      <w:r>
+        <w:rPr>
+          <w:i w:val="0"/>
+        </w:rPr>
+        <w:t>A voltage-mode class D stage runs from 50 V into a 12.5 Ω load at 13.56 MHz. Each switch has 20 pF of output capacitance. Find the output power, the capacitive switching loss, and the resulting efficiency. Repeat the loss calculation at 135.6 MHz.</w:t>
+      </w:r>
+    </w:p>
+    <w:p>
+      <w:pPr/>
+      <w:r>
+        <w:rPr>
+          <w:b/>
+        </w:rPr>
+        <w:t xml:space="preserve">Solution. </w:t>
+      </w:r>
+      <w:r>
+        <w:rPr>
+          <w:i w:val="0"/>
+        </w:rPr>
+        <w:t>V₁ = (2/π) × 50 = 31.83 V, so Pout = 31.83²/(2 × 12.5) = 40.5 W. The switch node has 40 pF, so the loss is 40 pF × 50² × 13.56 MHz = 1.36 W, and the efficiency, counting only this loss, is 40.5/41.9 = 96.8 %. At ten times the frequency the loss is 13.6 W and the efficiency falls to 40.5/54.1 = 74.9 %, which is why switching amplifiers above a few hundred megahertz move to class E, where the capacitance becomes part of the network.</w:t>
+      </w:r>
+    </w:p>
+    <w:p>
+      <w:pPr>
+        <w:pStyle w:val="Heading2"/>
+      </w:pPr>
+      <w:r>
+        <w:rPr>
+          <w:i w:val="0"/>
+        </w:rPr>
+        <w:t>41.3 Class E by the equations</w:t>
+      </w:r>
+    </w:p>
+    <w:p>
+      <w:pPr/>
+      <w:r>
+        <w:rPr>
+          <w:i w:val="0"/>
+        </w:rPr>
+        <w:t>Class E, designed in detail in Chapter 35, uses a single switch with a shunt capacitor and a series network tuned slightly above the operating frequency, so that the drain voltage rings back to zero, with zero slope, just as the switch closes. Its design equations fix everything from the supply and the power: the load R = 0.5768 VDD²/P, the shunt capacitance C = 0.1836/(ωR), an excess series reactance of 1.1525 R, a peak drain voltage of 3.562 VDD, and a peak current of 2.862 IDC. The shunt capacitance is the design's frequency limit: the device's own output capacitance must not exceed it, which gives the maximum frequency fmax = 0.1836/(2πR Cout). For a given device, a higher supply raises R and lowers the required C, so high-voltage devices reach higher frequencies in class E, but the peak voltage of 3.56 times the supply must stay inside the device's breakdown.</w:t>
+      </w:r>
+    </w:p>
+    <w:p>
+      <w:pPr>
+        <w:jc w:val="center"/>
+      </w:pPr>
+      <w:r>
+        <w:rPr>
+          <w:i w:val="0"/>
+        </w:rPr>
+        <w:t>R = 0.5768 VDD²/P,   C = 0.1836/(ωR),   X_excess = 1.1525 R,   v_pk = 3.562 VDD,   i_pk = 2.862 IDC</w:t>
+      </w:r>
+    </w:p>
+    <w:p>
+      <w:pPr>
+        <w:pStyle w:val="Heading2"/>
+      </w:pPr>
+      <w:r>
+        <w:rPr>
+          <w:i w:val="0"/>
+        </w:rPr>
+        <w:t>Worked Example 41.3</w:t>
+      </w:r>
+    </w:p>
+    <w:p>
+      <w:pPr/>
+      <w:r>
+        <w:rPr>
+          <w:b/>
+        </w:rPr>
+        <w:t xml:space="preserve">Problem. </w:t>
+      </w:r>
+      <w:r>
+        <w:rPr>
+          <w:i w:val="0"/>
+        </w:rPr>
+        <w:t>Design a class E stage for 10 W at 2.4 GHz from 12 V. Find R, C, the excess inductance, the peak voltage and current, and the largest device output capacitance that allows the design. Find the Q of an L-network that matches R to 50 Ω.</w:t>
+      </w:r>
+    </w:p>
+    <w:p>
+      <w:pPr/>
+      <w:r>
+        <w:rPr>
+          <w:b/>
+        </w:rPr>
+        <w:t xml:space="preserve">Solution. </w:t>
+      </w:r>
+      <w:r>
+        <w:rPr>
+          <w:i w:val="0"/>
+        </w:rPr>
+        <w:t>R = 0.5768 × 144/10 = 8.31 Ω. With ω = 1.508 × 10¹⁰ rad/s, C = 0.1836/(1.508 × 10¹⁰ × 8.31) = 1.47 pF. The excess reactance is 1.1525 × 8.31 = 9.57 Ω, an inductance of 9.57/ω = 0.63 nH. The peak voltage is 3.562 × 12 = 42.7 V. With IDC = 10/12 = 0.833 A, the peak current is 2.862 × 0.833 = 2.39 A. The device's output capacitance must be below 1.47 pF: a device with 1.5 pF would limit the design to 0.1836/(2π × 8.31 × 1.5 pF) = 2.35 GHz, just short, while one with 1.2 pF reaches 2.93 GHz. The L-network Q is √(50/8.31 − 1) = 2.24.</w:t>
+      </w:r>
+    </w:p>
+    <w:p>
+      <w:pPr>
+        <w:pStyle w:val="Heading2"/>
+      </w:pPr>
+      <w:r>
+        <w:rPr>
+          <w:i w:val="0"/>
+        </w:rPr>
+        <w:t>41.4 Harmonic tuning: class F, inverse F, J, and the continuous modes</w:t>
+      </w:r>
+    </w:p>
+    <w:p>
+      <w:pPr/>
+      <w:r>
+        <w:rPr>
+          <w:i w:val="0"/>
+        </w:rPr>
+        <w:t>Class F, Chapter 35, keeps the transistor a current source but terminates the harmonics so that the voltage and current waveforms do not overlap. Open circuits at the odd harmonics flatten the voltage toward a square wave of peak 2VDD; short circuits at the even harmonics leave the current a half sine. Inverse class F swaps them: the current approaches a square wave and the voltage a half sine with a peak of πVDD, which suits devices with high breakdown, such as gallium nitride, and lowers the current for a given power. With infinitely many harmonics both reach 100 %; with the second and third controlled, as practical networks do, they reach roughly 80 to 90 % in theory and 70 to 80 % in practice at a few gigahertz.</w:t>
+      </w:r>
+    </w:p>
+    <w:p>
+      <w:pPr/>
+      <w:r>
+        <w:rPr>
+          <w:i w:val="0"/>
+        </w:rPr>
+        <w:t>Class J, introduced by Steve Cripps, reaches class B's efficiency and power without a short at the second harmonic. Its fundamental load is Ropt + jRopt and its second-harmonic load a pure reactance, −j(3π/8)Ropt, so the voltage waveform becomes a skewed half sine whose overlap with the current still averages to class B's dissipation. Because a reactive second harmonic is much easier to present over a band than a short, class J and its generalization, the continuous class B/J mode, are the basis of most broadband high-efficiency amplifiers. In the continuous mode a parameter α between −1 and +1 sets the fundamental load to Ropt(1 + jα) and the second harmonic to −j(3π/8)α Ropt, and every member of that family has the same 78.5 % ideal efficiency. A matching network whose impedances drift with frequency along that family keeps the efficiency over an octave. Continuous class F extends the same idea to the third harmonic.</w:t>
+      </w:r>
+    </w:p>
+    <w:p>
+      <w:pPr>
+        <w:jc w:val="center"/>
+      </w:pPr>
+      <w:r>
+        <w:rPr>
+          <w:i w:val="0"/>
+        </w:rPr>
+        <w:t>continuous class B/J:  Z₁ = Ropt (1 + jα),   Z₂ = −j (3π/8) α Ropt,   −1 ≤ α ≤ 1</w:t>
+      </w:r>
+    </w:p>
+    <w:p>
+      <w:pPr>
+        <w:pStyle w:val="Heading2"/>
+      </w:pPr>
+      <w:r>
+        <w:rPr>
+          <w:i w:val="0"/>
+        </w:rPr>
+        <w:t>Worked Example 41.4</w:t>
+      </w:r>
+    </w:p>
+    <w:p>
+      <w:pPr/>
+      <w:r>
+        <w:rPr>
+          <w:b/>
+        </w:rPr>
+        <w:t xml:space="preserve">Problem. </w:t>
+      </w:r>
+      <w:r>
+        <w:rPr>
+          <w:i w:val="0"/>
+        </w:rPr>
+        <w:t>A 28 V gallium nitride device with a 3 V knee must deliver 10 W. Find Ropt, the class J fundamental and second-harmonic impedances, and the class B drain efficiency with the knee included.</w:t>
+      </w:r>
+    </w:p>
+    <w:p>
+      <w:pPr/>
+      <w:r>
+        <w:rPr>
+          <w:b/>
+        </w:rPr>
+        <w:t xml:space="preserve">Solution. </w:t>
+      </w:r>
+      <w:r>
+        <w:rPr>
+          <w:i w:val="0"/>
+        </w:rPr>
+        <w:t>Ropt = (28 − 3)²/(2 × 10) = 625/20 = 31.3 Ω. Class J needs Z₁ = 31.3 + j31.3 Ω and Z₂ = −j(3π/8) × 31.3 = −j36.8 Ω. In the continuous mode the fundamental reactance may range from −j31.3 to +j31.3 Ω, with the second-harmonic reactance following in proportion. The efficiency is (π/4)(25/28) = 70.1 %, the same for class B, for class J, and for every point of the continuous family.</w:t>
+      </w:r>
+    </w:p>
+    <w:p>
+      <w:pPr/>
+      <w:r>
+        <w:rPr>
+          <w:b/>
+        </w:rPr>
+        <w:t xml:space="preserve">Key idea. </w:t>
+      </w:r>
+      <w:r>
+        <w:rPr>
+          <w:i w:val="0"/>
+        </w:rPr>
+        <w:t>Harmonic tuning reaches high efficiency by shaping waveforms instead of shortening conduction. Class J shows that the second harmonic need not be shorted, only made reactive in the right proportion, which is what makes broadband efficient amplifiers possible.</w:t>
+      </w:r>
+    </w:p>
+    <w:p>
+      <w:pPr>
+        <w:pStyle w:val="Heading2"/>
+      </w:pPr>
+      <w:r>
+        <w:rPr>
+          <w:i w:val="0"/>
+        </w:rPr>
+        <w:t>41.5 Class S, and the classes that act on the supply</w:t>
+      </w:r>
+    </w:p>
+    <w:p>
+      <w:pPr/>
+      <w:r>
+        <w:rPr>
+          <w:i w:val="0"/>
+        </w:rPr>
+        <w:t>Class S is a switching amplifier driven by a pulse-width-modulated or delta-sigma bit stream, followed by a low-pass filter that recovers the signal. As an RF amplifier it needs switching rates many times the carrier, which limits it to low frequencies, but as an amplifier of the envelope it is exactly the supply modulator that envelope elimination and restoration, Section 36.3, requires: a buck converter whose duty cycle follows the envelope. Classes G and H are the other supply-side classes. Class G switches the amplifier between two or more fixed rails, choosing at each moment the lowest one that still clears the signal's peak; class H, in the audio usage that RF engineers have borrowed, varies the rail continuously to follow the signal. Average power tracking, APT, is the slow version used in handsets: the supply is set once per transmission slot to the lowest value that passes that slot's peaks, so it recovers efficiency when the phone transmits below its maximum power but not at maximum. Envelope tracking, ET, follows the instantaneous envelope, Section 36.2, and envelope elimination and restoration, due to Leonard Kahn in 1952, goes furthest: it drives a saturated, switching amplifier with a constant-envelope phase signal and restores the amplitude entirely through the supply, so the supply modulator carries the full amplitude accuracy of the transmitter.</w:t>
+      </w:r>
+    </w:p>
+    <w:p>
+      <w:pPr>
+        <w:pStyle w:val="Heading2"/>
+      </w:pPr>
+      <w:r>
+        <w:rPr>
+          <w:i w:val="0"/>
+        </w:rPr>
+        <w:t>41.6 Load modulation: the Doherty and Chireix outphasing amplifiers</w:t>
+      </w:r>
+    </w:p>
+    <w:p>
+      <w:pPr/>
+      <w:r>
+        <w:rPr>
+          <w:i w:val="0"/>
+        </w:rPr>
+        <w:t>The supply-side classes keep the load fixed and move the supply. The load-modulation architectures do the opposite. The Doherty amplifier, Section 23.3, lets a peaking amplifier inject current into the main amplifier's load through a quarter-wave inverter, so the main amplifier sees a higher impedance at back-off and saturates earlier, holding its peak efficiency down to a back-off set by the ratio of the two amplifiers' currents. For a peaking amplifier able to supply r times the main amplifier's peak current, that second efficiency peak falls at 20 log₁₀(1 + r) below full power: 6.0 dB for the symmetric Doherty, r = 1, and 9.5 dB for r = 2. Chireix outphasing, Section 36.4, drives two saturated amplifiers with constant-envelope signals of opposite phase offsets and combines them in a non-isolating combiner, so each amplifier sees a load that varies with the outphasing angle. Both architectures pair naturally with digital predistortion, because the load modulation they rely on is itself nonlinear.</w:t>
+      </w:r>
+    </w:p>
+    <w:p>
+      <w:pPr>
+        <w:jc w:val="center"/>
+      </w:pPr>
+      <w:r>
+        <w:rPr>
+          <w:i w:val="0"/>
+        </w:rPr>
+        <w:t>Doherty back-off peak: BO = 20 log₁₀(1 + r) dB</w:t>
+      </w:r>
+    </w:p>
+    <w:p>
+      <w:pPr>
+        <w:pStyle w:val="Heading2"/>
+      </w:pPr>
+      <w:r>
+        <w:rPr>
+          <w:i w:val="0"/>
+        </w:rPr>
+        <w:t>Worked Example 41.5</w:t>
+      </w:r>
+    </w:p>
+    <w:p>
+      <w:pPr/>
+      <w:r>
+        <w:rPr>
+          <w:b/>
+        </w:rPr>
+        <w:t xml:space="preserve">Problem. </w:t>
+      </w:r>
+      <w:r>
+        <w:rPr>
+          <w:i w:val="0"/>
+        </w:rPr>
+        <w:t>A signal has a 9.5 dB peak-to-average ratio after crest-factor reduction. Choose the asymmetry of a Doherty amplifier that puts its second efficiency peak at the average power, and compare the ideal efficiency there with a fixed-supply class B stage.</w:t>
+      </w:r>
+    </w:p>
+    <w:p>
+      <w:pPr/>
+      <w:r>
+        <w:rPr>
+          <w:b/>
+        </w:rPr>
+        <w:t xml:space="preserve">Solution. </w:t>
+      </w:r>
+      <w:r>
+        <w:rPr>
+          <w:i w:val="0"/>
+        </w:rPr>
+        <w:t>20 log₁₀(1 + r) = 9.5 dB gives 1 + r = 2.99, so r ≈ 2: the peaking amplifier must deliver twice the main amplifier's current, typically by making its device twice as large. At the average power the main amplifier is saturated, so the ideal efficiency is 78.5 %. A class B stage at 9.5 dB back-off reaches (π/4) × 10^(−9.5/20) = 0.785 × 0.335 = 26.3 %, three times less.</w:t>
+      </w:r>
+    </w:p>
+    <w:p>
+      <w:pPr>
+        <w:pStyle w:val="Heading2"/>
+      </w:pPr>
+      <w:r>
+        <w:rPr>
+          <w:i w:val="0"/>
+        </w:rPr>
+        <w:t>41.7 The classes compared</w:t>
+      </w:r>
+    </w:p>
+    <w:p>
+      <w:pPr/>
+      <w:r>
+        <w:rPr>
+          <w:i w:val="0"/>
+        </w:rPr>
+        <w:t>The book has no tables in its text, so the comparison is given as rows, one per class, each in the same order: how the device operates, its ideal peak efficiency, what is achieved in practice at a few gigahertz, its linearity, its peak drain voltage, and where it is used.</w:t>
+      </w:r>
+    </w:p>
+    <w:p>
+      <w:pPr/>
+      <w:r>
+        <w:rPr>
+          <w:i w:val="0"/>
+        </w:rPr>
+        <w:t>Class A: current source, full conduction; 50 %; 25 to 40 %; the most linear; 2VDD; low-power drivers and measurement amplifiers.</w:t>
+      </w:r>
+    </w:p>
+    <w:p>
+      <w:pPr/>
+      <w:r>
+        <w:rPr>
+          <w:i w:val="0"/>
+        </w:rPr>
+        <w:t>Class AB: current source, slightly more than half the cycle; between 50 and 78.5 %; 50 to 65 % at saturation; good, with gain expansion or compression near the bias point; 2VDD; most linear base-station and handset amplifiers, usually with predistortion.</w:t>
+      </w:r>
+    </w:p>
+    <w:p>
+      <w:pPr/>
+      <w:r>
+        <w:rPr>
+          <w:i w:val="0"/>
+        </w:rPr>
+        <w:t>Class B: current source, half the cycle; 78.5 %; 60 to 70 %; crossover distortion at low drive unless biased slightly into AB; 2VDD; push-pull and the main amplifier of a Doherty.</w:t>
+      </w:r>
+    </w:p>
+    <w:p>
+      <w:pPr/>
+      <w:r>
+        <w:rPr>
+          <w:i w:val="0"/>
+        </w:rPr>
+        <w:t>Class C: current source, less than half the cycle; up to 100 % as the angle shrinks, 89.7 % at 120°; 70 to 80 %; nonlinear, with low gain; 2VDD; constant-envelope FM and the peaking amplifier of a Doherty.</w:t>
+      </w:r>
+    </w:p>
+    <w:p>
+      <w:pPr/>
+      <w:r>
+        <w:rPr>
+          <w:i w:val="0"/>
+        </w:rPr>
+        <w:t>Class D, voltage mode: two switches and a series filter; 100 %; above 90 % at a few megahertz, falling with frequency through capacitive loss; linear only through the supply or pulse-width modulation; VDD across each switch; audio, induction heating, and the 13.56 MHz band.</w:t>
+      </w:r>
+    </w:p>
+    <w:p>
+      <w:pPr/>
+      <w:r>
+        <w:rPr>
+          <w:i w:val="0"/>
+        </w:rPr>
+        <w:t>Class E: one switch with shunt capacitor and tuned load; 100 %; 70 to 85 % up to a few gigahertz; nonlinear, amplitude only through the supply; 3.56VDD; constant-envelope transmitters, wireless power, and the saturated amplifier of polar and EER systems.</w:t>
+      </w:r>
+    </w:p>
+    <w:p>
+      <w:pPr/>
+      <w:r>
+        <w:rPr>
+          <w:i w:val="0"/>
+        </w:rPr>
+        <w:t>Class F and inverse F: current source with harmonic terminations; 100 % with all harmonics, about 80 to 90 % with the second and third; 70 to 80 %; moderate, used saturated; 2VDD for F, πVDD for inverse F; high-efficiency narrowband stages in base stations and satellites.</w:t>
+      </w:r>
+    </w:p>
+    <w:p>
+      <w:pPr/>
+      <w:r>
+        <w:rPr>
+          <w:i w:val="0"/>
+        </w:rPr>
+        <w:t>Class J and continuous modes: current source with reactive harmonic loads; 78.5 %, the same as class B; 60 to 75 % over an octave; similar to class B, with stronger AM-PM; above 2VDD; broadband military and test amplifiers, and wideband base stations.</w:t>
+      </w:r>
+    </w:p>
+    <w:p>
+      <w:pPr/>
+      <w:r>
+        <w:rPr>
+          <w:i w:val="0"/>
+        </w:rPr>
+        <w:t>Class S: switching with pulse-width or delta-sigma drive and a filter; 100 %; limited by switching rate; linear through modulation; VDD; envelope modulators and low-frequency transmitters.</w:t>
+      </w:r>
+    </w:p>
+    <w:p>
+      <w:pPr/>
+      <w:r>
+        <w:rPr>
+          <w:i w:val="0"/>
+        </w:rPr>
+        <w:t>Doherty and outphasing: two amplifiers with load modulation; 78.5 % at full power and at a chosen back-off; 45 to 55 % average with modulated signals; requires predistortion; set by the class of each amplifier; almost every macro base station, for the Doherty.</w:t>
+      </w:r>
+    </w:p>
+    <w:p>
+      <w:pPr/>
+      <w:r>
+        <w:rPr>
+          <w:i w:val="0"/>
+        </w:rPr>
+        <w:t>Supply modulation, classes G and H, APT, ET, and EER: any class with a moving supply; the class's peak efficiency held over the envelope, multiplied by the modulator's efficiency; 40 to 60 % average; requires calibration and usually predistortion; set by the peak supply; handsets for APT and ET, and some base stations.</w:t>
+      </w:r>
+    </w:p>
+    <w:p>
+      <w:pPr/>
+      <w:r>
+        <w:rPr>
+          <w:b/>
+        </w:rPr>
+        <w:t xml:space="preserve">Key idea. </w:t>
+      </w:r>
+      <w:r>
+        <w:rPr>
+          <w:i w:val="0"/>
+        </w:rPr>
+        <w:t>No class wins on every row. Switching classes win on peak efficiency, current-source classes on linearity, load and supply modulation on average efficiency with modulated signals, and predistortion is what lets an efficient amplifier meet a linearity mask.</w:t>
+      </w:r>
+    </w:p>
+    <w:p>
+      <w:pPr>
+        <w:pStyle w:val="Heading2"/>
+      </w:pPr>
+      <w:r>
+        <w:rPr>
+          <w:i w:val="0"/>
+        </w:rPr>
+        <w:t>41.8 Linearity, efficiency, and why the average is what counts</w:t>
+      </w:r>
+    </w:p>
+    <w:p>
+      <w:pPr/>
+      <w:r>
+        <w:rPr>
+          <w:i w:val="0"/>
+        </w:rPr>
+        <w:t>A modern transmitter is judged by two numbers that pull against each other. The spectral mask and adjacent-channel leakage ratio, ACLR, together with the error-vector magnitude, EVM, set how linear it must be; the battery or the electricity bill sets how efficient. A fixed-supply amplifier is most efficient at saturation and most linear well below it, and with OFDM and LTE signals, whose peak-to-average ratio is 7 to 10 dB after crest-factor reduction, the average output is far below saturation. For class B with a fixed supply the efficiency at an output amplitude v, normalized to the peak, is (π/4)v, because the DC current is proportional to the amplitude while the output power goes as its square. The efficiency at the average power of an 8 dB signal is therefore (π/4) × 10^(−8/20) = 31 %, the number Chapters 23 and 36 used. A truer average weights the efficiency by how often each amplitude occurs. The envelope of an OFDM signal is close to Rayleigh-distributed, and for class B the average efficiency is (π/4)⟨v²⟩/⟨v⟩, the ratio of average output power to average DC current, which is somewhat better than the efficiency at the average point, because the high-amplitude moments are efficient. Digital predistortion, Chapter 38, then lets the amplifier run closer to saturation for the same ACLR, typically improving ACLR by 15 to 20 dB and allowing several decibels less back-off.</w:t>
+      </w:r>
+    </w:p>
+    <w:p>
+      <w:pPr>
+        <w:jc w:val="center"/>
+      </w:pPr>
+      <w:r>
+        <w:rPr>
+          <w:i w:val="0"/>
+        </w:rPr>
+        <w:t>η_B(v) = (π/4) v,    ⟨η_B⟩ = (π/4) ⟨v²⟩ / ⟨v⟩;   Rayleigh: ⟨v⟩ = √(π/4) × √⟨v²⟩</w:t>
+      </w:r>
+    </w:p>
+    <w:p>
+      <w:pPr>
+        <w:pStyle w:val="Heading2"/>
+      </w:pPr>
+      <w:r>
+        <w:rPr>
+          <w:i w:val="0"/>
+        </w:rPr>
+        <w:t>Worked Example 41.6</w:t>
+      </w:r>
+    </w:p>
+    <w:p>
+      <w:pPr/>
+      <w:r>
+        <w:rPr>
+          <w:b/>
+        </w:rPr>
+        <w:t xml:space="preserve">Problem. </w:t>
+      </w:r>
+      <w:r>
+        <w:rPr>
+          <w:i w:val="0"/>
+        </w:rPr>
+        <w:t>An LTE handset transmits 23 dBm average with an 8 dB peak-to-average ratio. Find the fixed-supply class B efficiency at the average power and averaged over a Rayleigh envelope, and the supply power in each case. Compare an envelope tracker that holds the amplifier at 65 % with an 85 % modulator.</w:t>
+      </w:r>
+    </w:p>
+    <w:p>
+      <w:pPr/>
+      <w:r>
+        <w:rPr>
+          <w:b/>
+        </w:rPr>
+        <w:t xml:space="preserve">Solution. </w:t>
+      </w:r>
+      <w:r>
+        <w:rPr>
+          <w:i w:val="0"/>
+        </w:rPr>
+        <w:t>Normalized to the peak, ⟨v²⟩ = 10^(−0.8) = 0.158, and the efficiency at the average power is 0.785 × 0.398 = 31.3 %. For a Rayleigh envelope, ⟨v⟩ = 0.886 × √0.158 = 0.353, so ⟨η⟩ = 0.785 × 0.158/0.353 = 35.3 %. At 200 mW out the supply power is 0.64 W at 31.3 % and 0.57 W at 35.3 %. The envelope tracker reaches 0.65 × 0.85 = 55.3 %, so 0.36 W, 36 % less than the Rayleigh-averaged class B and the difference between a warm phone and a cool one.</w:t>
+      </w:r>
+    </w:p>
+    <w:p>
+      <w:pPr>
+        <w:pStyle w:val="Heading2"/>
+      </w:pPr>
+      <w:r>
+        <w:rPr>
+          <w:i w:val="0"/>
+        </w:rPr>
+        <w:t>41.9 Raising the supply above its nominal rail on peaks</w:t>
+      </w:r>
+    </w:p>
+    <w:p>
+      <w:pPr/>
+      <w:r>
+        <w:rPr>
+          <w:i w:val="0"/>
+        </w:rPr>
+        <w:t>Every efficiency in this chapter was set by how close the drain swings to the supply, and supply modulation so far has only lowered the supply when the signal is small. The same modulator can also raise it, above the nominal rail, for the short moments when the signal peaks. The reason is the optimum-load relation of Section 41.1: the peak power available from a load Ropt is (V − Vk)²/(2Ropt), so a supply that rises from VDD to a boosted VB on the peaks delivers more peak power from the same load, or the same peak power from a higher load with less current. Handsets need this because the battery sags from 4.4 V when charged to about 3.4 V near empty, and a power amplifier designed for the full output at 4.4 V would otherwise lose its peaks, and with them its ACLR, as the battery discharges. Base stations use it to run a device designed for a 28 V or 48 V rail at a higher peak voltage, choosing a higher Ropt that is easier to match over a wide band.</w:t>
+      </w:r>
+    </w:p>
+    <w:p>
+      <w:pPr/>
+      <w:r>
+        <w:rPr>
+          <w:i w:val="0"/>
+        </w:rPr>
+        <w:t>Three circuits provide the boost. A buck-boost envelope tracker includes a boost stage, so its output can follow the envelope from well below the battery to well above it. A separate boost converter can charge a higher rail that a class G switch selects only when the envelope needs it. A bootstrap or flying-capacitor stage stacks a capacitor, charged to the battery voltage between peaks, in series with the supply for the duration of a peak, nearly doubling the rail for microseconds without a converter running at the full power. Because the OFDM envelope is close to Rayleigh, the probability that the instantaneous power exceeds the average by a factor k is exp(−k): 13.5 % at 3 dB above average, 1.9 % at 6 dB, 0.03 % at 9 dB. The boost circuit works only a small fraction of the time, so its own efficiency matters much less than that of the main modulator, and its capacitor needs to supply only the charge of the longest likely peak, C = I t/ΔV for a current I, a duration t, and an allowed droop ΔV.</w:t>
+      </w:r>
+    </w:p>
+    <w:p>
+      <w:pPr>
+        <w:jc w:val="center"/>
+      </w:pPr>
+      <w:r>
+        <w:rPr>
+          <w:i w:val="0"/>
+        </w:rPr>
+        <w:t>P_peak = (V_B − Vk)² / (2 Ropt),    Pr{p &gt; k ⟨p⟩} = exp(−k),    C = I t / ΔV</w:t>
+      </w:r>
+    </w:p>
+    <w:p>
+      <w:pPr>
+        <w:pStyle w:val="Heading2"/>
+      </w:pPr>
+      <w:r>
+        <w:rPr>
+          <w:i w:val="0"/>
+        </w:rPr>
+        <w:t>Worked Example 41.7</w:t>
+      </w:r>
+    </w:p>
+    <w:p>
+      <w:pPr/>
+      <w:r>
+        <w:rPr>
+          <w:b/>
+        </w:rPr>
+        <w:t xml:space="preserve">Problem. </w:t>
+      </w:r>
+      <w:r>
+        <w:rPr>
+          <w:i w:val="0"/>
+        </w:rPr>
+        <w:t>A handset amplifier must deliver 31 dBm peaks, 23 dBm average with an 8 dB peak-to-average ratio. It is designed for a 4.6 V peak supply with a 0.4 V knee. Find Ropt. Near empty the battery gives 3.4 V: what peak power remains without boost, and for what fraction of the time must a boost stage raise the supply? A bootstrap capacitor supplies the peak DC current for up to 1 µs with 0.2 V of droop. Find its value.</w:t>
+      </w:r>
+    </w:p>
+    <w:p>
+      <w:pPr/>
+      <w:r>
+        <w:rPr>
+          <w:b/>
+        </w:rPr>
+        <w:t xml:space="preserve">Solution. </w:t>
+      </w:r>
+      <w:r>
+        <w:rPr>
+          <w:i w:val="0"/>
+        </w:rPr>
+        <w:t>The peak power is 1.26 W, so Ropt = (4.6 − 0.4)²/(2 × 1.26) = 17.64/2.52 = 7.0 Ω. At 3.4 V the peak is (3.0)²/(2 × 7.0) = 0.64 W, or 28.1 dBm, 2.9 dB short of the requirement. The supply must therefore be boosted whenever the instantaneous power exceeds 28.1 dBm, 5.1 dB above the average, a factor of 3.24, which happens exp(−3.24) = 3.9 % of the time. At the peak the fundamental current is 2 × 1.26/4.2 = 0.60 A, and the class B DC current is (2/π) × 0.60 = 0.38 A, so C = 0.38 A × 1 µs / 0.2 V = 1.9 µF, a single small ceramic capacitor once its DC-bias derating is allowed for.</w:t>
+      </w:r>
+    </w:p>
+    <w:p>
+      <w:pPr/>
+      <w:r>
+        <w:rPr>
+          <w:b/>
+        </w:rPr>
+        <w:t xml:space="preserve">Key idea. </w:t>
+      </w:r>
+      <w:r>
+        <w:rPr>
+          <w:i w:val="0"/>
+        </w:rPr>
+        <w:t>A supply that rises above its nominal rail only on the rare peaks gives the amplifier its full peak power from a sagging battery or a lower rail, while the boost circuit works for only a few percent of the time. The envelope's statistics, not its peak, size the boost.</w:t>
+      </w:r>
+    </w:p>
+    <w:p>
+      <w:pPr>
+        <w:pStyle w:val="Heading2"/>
+      </w:pPr>
+      <w:r>
+        <w:rPr>
+          <w:i w:val="0"/>
+        </w:rPr>
+        <w:t>41.10 The supply modulator: bandwidth, efficiency, alignment, and predistortion</w:t>
+      </w:r>
+    </w:p>
+    <w:p>
+      <w:pPr/>
+      <w:r>
+        <w:rPr>
+          <w:i w:val="0"/>
+        </w:rPr>
+        <w:t>The supply modulator is a power amplifier for the envelope, and it inherits that problem's trade-offs. Its bandwidth must be about three to five times the RF signal's, Section 36.2, because the envelope, the magnitude of the complex signal, is spread wider than the signal itself. Switching converters are efficient, 90 % or more, but their bandwidth is limited to a fraction of their switching frequency, so most wideband trackers are hybrids: a switcher supplies the slow, high-power part of the envelope, and a fast class AB linear amplifier in parallel corrects the residual, with the combined efficiency typically 75 to 85 %. To relax the requirement, the shaping table that maps the envelope to the supply voltage is usually not exact: it holds a minimum voltage at low envelopes, where efficiency hardly matters and the linear stage would dominate, and it smooths the fastest excursions, accepting slight gain compression.</w:t>
+      </w:r>
+    </w:p>
+    <w:p>
+      <w:pPr/>
+      <w:r>
+        <w:rPr>
+          <w:i w:val="0"/>
+        </w:rPr>
+        <w:t>The envelope and the RF signal travel through different paths and must arrive at the transistor together. A delay error Δt between them makes the supply wrong by roughly its rate of change times Δt, and for an envelope with components up to half the RF bandwidth B the worst relative error is about πBΔt. Near compression the amplifier's gain and phase depend on the supply, so that error appears as AM-AM and AM-PM distortion, raising ACLR and EVM; the drain capacitance of the transistor varies with voltage, which makes AM-PM the more troublesome of the two. Predistortion can correct the distortion only if the supply trajectory is repeatable, which is a second reason for a fixed shaping table: when the supply is a fixed function of the input envelope, the amplifier with its modulator behaves as one nonlinear system with memory, and the memory polynomial of Chapter 38 fits it. The delay is then calibrated in production and tracked in operation, typically to a fraction of a nanosecond.</w:t>
+      </w:r>
+    </w:p>
+    <w:p>
+      <w:pPr>
+        <w:jc w:val="center"/>
+      </w:pPr>
+      <w:r>
+        <w:rPr>
+          <w:i w:val="0"/>
+        </w:rPr>
+        <w:t>B_modulator ≈ 3 to 5 × B_signal,    ε_delay ≈ π B Δt,    η_total = η_PA × η_modulator</w:t>
+      </w:r>
+    </w:p>
+    <w:p>
+      <w:pPr>
+        <w:pStyle w:val="Heading2"/>
+      </w:pPr>
+      <w:r>
+        <w:rPr>
+          <w:i w:val="0"/>
+        </w:rPr>
+        <w:t>Worked Example 41.8</w:t>
+      </w:r>
+    </w:p>
+    <w:p>
+      <w:pPr/>
+      <w:r>
+        <w:rPr>
+          <w:b/>
+        </w:rPr>
+        <w:t xml:space="preserve">Problem. </w:t>
+      </w:r>
+      <w:r>
+        <w:rPr>
+          <w:i w:val="0"/>
+        </w:rPr>
+        <w:t>Estimate the worst relative supply error caused by a 1 ns misalignment for a 20 MHz LTE carrier, and the alignment needed to keep that error 40 dB below the signal. Repeat the requirement for a 100 MHz carrier.</w:t>
+      </w:r>
+    </w:p>
+    <w:p>
+      <w:pPr/>
+      <w:r>
+        <w:rPr>
+          <w:b/>
+        </w:rPr>
+        <w:t xml:space="preserve">Solution. </w:t>
+      </w:r>
+      <w:r>
+        <w:rPr>
+          <w:i w:val="0"/>
+        </w:rPr>
+        <w:t>For 20 MHz, πBΔt = π × 20 × 10⁶ × 10⁻⁹ = 0.063, an error 24 dB below the envelope, enough to dominate a −45 dBc ACLR budget. Keeping it 40 dB down, a ratio of 0.01, needs Δt ≤ 0.01/(π × 20 × 10⁶) = 0.16 ns. For 100 MHz the requirement shrinks five times, to 32 ps. The estimate is pessimistic, because near compression with a shaping table the amplifier's output depends only weakly on small supply errors, but it shows why alignment is calibrated in picoseconds and why tracking 100 MHz carriers is hard.</w:t>
+      </w:r>
+    </w:p>
+    <w:p>
+      <w:pPr>
+        <w:pStyle w:val="Heading2"/>
+      </w:pPr>
+      <w:r>
+        <w:rPr>
+          <w:i w:val="0"/>
+        </w:rPr>
+        <w:t>41.11 A worked design: a 10 W average base-station amplifier with a boosted tracking supply</w:t>
+      </w:r>
+    </w:p>
+    <w:p>
+      <w:pPr/>
+      <w:r>
+        <w:rPr>
+          <w:i w:val="0"/>
+        </w:rPr>
+        <w:t>The last example puts the chapter together. A small-cell base station must deliver 10 W average, 40 dBm, of a 20 MHz LTE or NR carrier whose peak-to-average ratio after crest-factor reduction is 8 dB, so the peaks are 48 dBm, 63.1 W. The device is a gallium nitride transistor normally used on a 28 V rail, with a 3 V knee and a breakdown voltage well above twice any supply the design uses. The design choice is whether to size the device and its load for 28 V, or to let an envelope tracker raise the supply to 40 V on the peaks.</w:t>
+      </w:r>
+    </w:p>
+    <w:p>
+      <w:pPr>
+        <w:pStyle w:val="Heading2"/>
+      </w:pPr>
+      <w:r>
+        <w:rPr>
+          <w:i w:val="0"/>
+        </w:rPr>
+        <w:t>Worked Example 41.9</w:t>
+      </w:r>
+    </w:p>
+    <w:p>
+      <w:pPr/>
+      <w:r>
+        <w:rPr>
+          <w:b/>
+        </w:rPr>
+        <w:t xml:space="preserve">Problem. </w:t>
+      </w:r>
+      <w:r>
+        <w:rPr>
+          <w:i w:val="0"/>
+        </w:rPr>
+        <w:t>Find Ropt and the peak fundamental current for 63.1 W peaks with a 28 V supply and with a 40 V boosted peak supply, and the L-network Q from each Ropt to 50 Ω. With Ropt chosen for 40 V, what peak power does a plain 28 V supply give, and for what fraction of the time must the tracker exceed 28 V? With the tracker holding the amplifier at 60 % and an 82 % efficient modulator, find the supply power and dissipation, and compare a fixed-supply class AB stage that reaches 25 % at this back-off. What modulator bandwidth is needed?</w:t>
+      </w:r>
+    </w:p>
+    <w:p>
+      <w:pPr/>
+      <w:r>
+        <w:rPr>
+          <w:b/>
+        </w:rPr>
+        <w:t xml:space="preserve">Solution. </w:t>
+      </w:r>
+      <w:r>
+        <w:rPr>
+          <w:i w:val="0"/>
+        </w:rPr>
+        <w:t>At 28 V, Ropt = 25²/(2 × 63.1) = 4.95 Ω and the peak fundamental current is 2 × 63.1/25 = 5.05 A; at 40 V, Ropt = 37²/126.2 = 10.85 Ω and the current is 126.2/37 = 3.41 A, a third less, with the drain swinging to about 80 V at the peaks. The L-network Q to 50 Ω falls from √(50/4.95 − 1) = 3.02 to √(50/10.85 − 1) = 1.90, a wider bandwidth and lower matching loss. With the 10.85 Ω load, a 28 V supply gives only 25²/(2 × 10.85) = 28.8 W, 44.6 dBm, 3.4 dB short of the peaks, so the tracker must exceed 28 V whenever the instantaneous power is more than 4.6 dB above average, a factor of 2.88, which happens exp(−2.88) = 5.6 % of the time. The overall efficiency is 0.60 × 0.82 = 49.2 %, so the supply power is 10/0.492 = 20.3 W and the dissipation 10.3 W, against 40 W and 30 W for the fixed-supply class AB stage: half the electricity and a third of the heat. The modulator needs three to five times 20 MHz, 60 to 100 MHz, within reach of a hybrid tracker.</w:t>
+      </w:r>
+    </w:p>
+    <w:p>
+      <w:pPr>
+        <w:pStyle w:val="Heading2"/>
+      </w:pPr>
+      <w:r>
+        <w:rPr>
+          <w:i w:val="0"/>
+        </w:rPr>
+        <w:t>41.12 The whole radio</w:t>
+      </w:r>
+    </w:p>
+    <w:p>
+      <w:pPr/>
+      <w:r>
+        <w:rPr>
+          <w:i w:val="0"/>
+        </w:rPr>
+        <w:t>With the amplifier classes compared and the supply made to follow the signal, and on its peaks to exceed its rail, the radio is complete. The transmitter now measures what it sends, the network tells it how much to send, and every decibel it saves after the last amplifier is a decibel it never had to generate. Looking back over the book, a few ideas carried every chapter. A line longer than a small fraction of a wavelength must be matched or it reflects. Every match, filter, and antenna trades bandwidth against loss and size. Every amplifier trades linearity against efficiency, and every receiver trades sensitivity against the strong signals it must survive.</w:t>
       </w:r>
     </w:p>
     <w:p>
@@ -15087,7 +16120,7 @@
         <w:rPr>
           <w:i w:val="0"/>
         </w:rPr>
-        <w:t>A 33 dBm transmitter uses a 30 dB coupler and a detector whose maximum is 0 dBm. What pad is needed?</w:t>
+        <w:t>Derive the class A efficiency from the DC and fundamental currents of a full sine about a bias of Imax/2.</w:t>
       </w:r>
     </w:p>
     <w:p>
@@ -15102,7 +16135,7 @@
         <w:rPr>
           <w:i w:val="0"/>
         </w:rPr>
-        <w:t>Find the directivity error bounds for RL + D = 40 dB.</w:t>
+        <w:t>Find the ideal efficiency at a conduction angle of 200°.</w:t>
       </w:r>
     </w:p>
     <w:p>
@@ -15117,7 +16150,7 @@
         <w:rPr>
           <w:i w:val="0"/>
         </w:rPr>
-        <w:t>What is the handset output range from −40 dBm to 23 dBm?</w:t>
+        <w:t>A voltage-mode class D stage runs from 24 V into 8 Ω. Find its output power.</w:t>
       </w:r>
     </w:p>
     <w:p>
@@ -15132,7 +16165,7 @@
         <w:rPr>
           <w:i w:val="0"/>
         </w:rPr>
-        <w:t>Convert 15 dBm to milliwatts.</w:t>
+        <w:t>Find the class E load resistance and shunt capacitance for 25 W at 1 GHz from 28 V.</w:t>
       </w:r>
     </w:p>
     <w:p>
@@ -15147,7 +16180,7 @@
         <w:rPr>
           <w:i w:val="0"/>
         </w:rPr>
-        <w:t>Why does a peak-responding detector read high for OFDM?</w:t>
+        <w:t>Find Ropt and the class J second-harmonic reactance for 5 W from a 12 V device with a 1 V knee.</w:t>
       </w:r>
     </w:p>
     <w:p>
@@ -15162,7 +16195,67 @@
         <w:rPr>
           <w:i w:val="0"/>
         </w:rPr>
-        <w:t>What does a log detector's output voltage track?</w:t>
+        <w:t>At what back-off does a Doherty amplifier with r = 1.5 have its second efficiency peak?</w:t>
+      </w:r>
+    </w:p>
+    <w:p>
+      <w:pPr/>
+      <w:r>
+        <w:rPr>
+          <w:b/>
+        </w:rPr>
+        <w:t xml:space="preserve">7. </w:t>
+      </w:r>
+      <w:r>
+        <w:rPr>
+          <w:i w:val="0"/>
+        </w:rPr>
+        <w:t>For what fraction of the time does a Rayleigh-envelope signal exceed its average power by 4 dB?</w:t>
+      </w:r>
+    </w:p>
+    <w:p>
+      <w:pPr/>
+      <w:r>
+        <w:rPr>
+          <w:b/>
+        </w:rPr>
+        <w:t xml:space="preserve">8. </w:t>
+      </w:r>
+      <w:r>
+        <w:rPr>
+          <w:i w:val="0"/>
+        </w:rPr>
+        <w:t>A boost stage must supply 0.5 A for 2 µs with 0.25 V of droop. Find the capacitance.</w:t>
+      </w:r>
+    </w:p>
+    <w:p>
+      <w:pPr/>
+      <w:r>
+        <w:rPr>
+          <w:b/>
+        </w:rPr>
+        <w:t xml:space="preserve">9. </w:t>
+      </w:r>
+      <w:r>
+        <w:rPr>
+          <w:i w:val="0"/>
+        </w:rPr>
+        <w:t>Find the alignment that keeps the delay error 40 dB down for a 40 MHz carrier.</w:t>
+      </w:r>
+    </w:p>
+    <w:p>
+      <w:pPr/>
+      <w:r>
+        <w:rPr>
+          <w:b/>
+        </w:rPr>
+        <w:t xml:space="preserve">10. </w:t>
+      </w:r>
+      <w:r>
+        <w:rPr>
+          <w:i w:val="0"/>
+        </w:rPr>
+        <w:t>Why does a fixed shaping table make predistortion of an envelope-tracking amplifier easier?</w:t>
       </w:r>
     </w:p>
     <w:p>
@@ -15461,6 +16554,15 @@
         <w:rPr>
           <w:i w:val="0"/>
         </w:rPr>
+        <w:t>Class A η = 50 %, class B π/4; Ropt = (VDD − Vk)²/(2P). Class D V₁ = (2/π)VDD, capacitive loss C VDD² f. Class J: Z₁ = Ropt(1 + jα), Z₂ = −j(3π/8)αRopt. Doherty back-off peak 20 log₁₀(1 + r). Rayleigh envelope: Pr{p &gt; k⟨p⟩} = exp(−k); class B average ⟨η⟩ = (π/4)⟨v²⟩/⟨v⟩. Boost capacitor C = It/ΔV; delay error ≈ πBΔt.</w:t>
+      </w:r>
+    </w:p>
+    <w:p>
+      <w:pPr/>
+      <w:r>
+        <w:rPr>
+          <w:i w:val="0"/>
+        </w:rPr>
         <w:t>PAE = (Pout − Pin)/PDC; P_IM3 = 3Pout − 2·OIP3; class B η = (π/4)10^(−BO/20). Fractional-N: fout = (N + F/2^k)fref; in-band L ≈ FOM + 10 log f_PFD + 20 log N. DDS: fout = FTW·fclk/2^n, spur ≈ −6.02P dBc. Directivity error 20 log(1 ± 10^(−(RL + D)/20)).</w:t>
       </w:r>
     </w:p>
@@ -19502,6 +20604,167 @@
     </w:p>
     <w:p>
       <w:pPr>
+        <w:pStyle w:val="Heading2"/>
+      </w:pPr>
+      <w:r>
+        <w:rPr>
+          <w:i w:val="0"/>
+        </w:rPr>
+        <w:t>Chapter 41</w:t>
+      </w:r>
+    </w:p>
+    <w:p>
+      <w:pPr/>
+      <w:r>
+        <w:rPr>
+          <w:b/>
+        </w:rPr>
+        <w:t xml:space="preserve">1. </w:t>
+      </w:r>
+      <w:r>
+        <w:rPr>
+          <w:i w:val="0"/>
+        </w:rPr>
+        <w:t>The current Imax/2 + (Imax/2) sin ωt has IDC = Imax/2 and I₁ = Imax/2. With V₁ = VDD, Pout = VDD Imax/4 and PDC = VDD Imax/2, so η = 50 %.</w:t>
+      </w:r>
+    </w:p>
+    <w:p>
+      <w:pPr/>
+      <w:r>
+        <w:rPr>
+          <w:b/>
+        </w:rPr>
+        <w:t xml:space="preserve">2. </w:t>
+      </w:r>
+      <w:r>
+        <w:rPr>
+          <w:i w:val="0"/>
+        </w:rPr>
+        <w:t>74.4 %.</w:t>
+      </w:r>
+    </w:p>
+    <w:p>
+      <w:pPr/>
+      <w:r>
+        <w:rPr>
+          <w:b/>
+        </w:rPr>
+        <w:t xml:space="preserve">3. </w:t>
+      </w:r>
+      <w:r>
+        <w:rPr>
+          <w:i w:val="0"/>
+        </w:rPr>
+        <w:t>V₁ = (2/π) × 24 = 15.3 V, so Pout = 15.3²/16 = 14.6 W.</w:t>
+      </w:r>
+    </w:p>
+    <w:p>
+      <w:pPr/>
+      <w:r>
+        <w:rPr>
+          <w:b/>
+        </w:rPr>
+        <w:t xml:space="preserve">4. </w:t>
+      </w:r>
+      <w:r>
+        <w:rPr>
+          <w:i w:val="0"/>
+        </w:rPr>
+        <w:t>R = 0.5768 × 784/25 = 18.1 Ω; C = 0.1836/(2π × 10⁹ × 18.1) = 1.62 pF.</w:t>
+      </w:r>
+    </w:p>
+    <w:p>
+      <w:pPr/>
+      <w:r>
+        <w:rPr>
+          <w:b/>
+        </w:rPr>
+        <w:t xml:space="preserve">5. </w:t>
+      </w:r>
+      <w:r>
+        <w:rPr>
+          <w:i w:val="0"/>
+        </w:rPr>
+        <w:t>Ropt = 11²/10 = 12.1 Ω; Z₂ = −j(3π/8) × 12.1 = −j14.3 Ω.</w:t>
+      </w:r>
+    </w:p>
+    <w:p>
+      <w:pPr/>
+      <w:r>
+        <w:rPr>
+          <w:b/>
+        </w:rPr>
+        <w:t xml:space="preserve">6. </w:t>
+      </w:r>
+      <w:r>
+        <w:rPr>
+          <w:i w:val="0"/>
+        </w:rPr>
+        <w:t>20 log₁₀ 2.5 = 8.0 dB.</w:t>
+      </w:r>
+    </w:p>
+    <w:p>
+      <w:pPr/>
+      <w:r>
+        <w:rPr>
+          <w:b/>
+        </w:rPr>
+        <w:t xml:space="preserve">7. </w:t>
+      </w:r>
+      <w:r>
+        <w:rPr>
+          <w:i w:val="0"/>
+        </w:rPr>
+        <w:t>exp(−10^0.4) = exp(−2.51) = 8.1 %.</w:t>
+      </w:r>
+    </w:p>
+    <w:p>
+      <w:pPr/>
+      <w:r>
+        <w:rPr>
+          <w:b/>
+        </w:rPr>
+        <w:t xml:space="preserve">8. </w:t>
+      </w:r>
+      <w:r>
+        <w:rPr>
+          <w:i w:val="0"/>
+        </w:rPr>
+        <w:t>0.5 × 2 × 10⁻⁶ / 0.25 = 4.0 µF.</w:t>
+      </w:r>
+    </w:p>
+    <w:p>
+      <w:pPr/>
+      <w:r>
+        <w:rPr>
+          <w:b/>
+        </w:rPr>
+        <w:t xml:space="preserve">9. </w:t>
+      </w:r>
+      <w:r>
+        <w:rPr>
+          <w:i w:val="0"/>
+        </w:rPr>
+        <w:t>0.01/(π × 40 × 10⁶) = 80 ps.</w:t>
+      </w:r>
+    </w:p>
+    <w:p>
+      <w:pPr/>
+      <w:r>
+        <w:rPr>
+          <w:b/>
+        </w:rPr>
+        <w:t xml:space="preserve">10. </w:t>
+      </w:r>
+      <w:r>
+        <w:rPr>
+          <w:i w:val="0"/>
+        </w:rPr>
+        <w:t>The supply becomes a fixed function of the input envelope, so the amplifier and modulator act as one nonlinear system with memory that a memory polynomial can model and invert; an independently varying supply would add a second input the predistorter cannot see.</w:t>
+      </w:r>
+    </w:p>
+    <w:p>
+      <w:pPr>
         <w:pStyle w:val="Heading1"/>
       </w:pPr>
       <w:r>
@@ -19770,6 +21033,15 @@
           <w:i w:val="0"/>
         </w:rPr>
         <w:t>Dean Banerjee, PLL Performance, Simulation, and Design, and Analog Devices, A Technical Tutorial on Digital Signal Synthesis, for Chapter 39; Analog Devices and Texas Instruments application notes on RF power detectors, for Chapter 40.</w:t>
+      </w:r>
+    </w:p>
+    <w:p>
+      <w:pPr/>
+      <w:r>
+        <w:rPr>
+          <w:i w:val="0"/>
+        </w:rPr>
+        <w:t>Steve C. Cripps, RF Power Amplifiers for Wireless Communications, 2nd edition, and P. Wright, J. Lees, J. Benedikt, P. J. Tasker, and S. C. Cripps, "A Methodology for Realizing High Efficiency Class-J in a Linear and Broadband PA," IEEE Trans. MTT, 2009, for class J and the continuous modes; L. R. Kahn, "Single-Sideband Transmission by Envelope Elimination and Restoration," Proceedings of the IRE, 1952; Zhancang Wang, Envelope Tracking Power Amplifiers for Wireless Communications, Artech House, 2014; and F. H. Raab et al. (IEEE MTT, 2002) for the comparison of classes, for Chapter 41.</w:t>
       </w:r>
     </w:p>
     <w:sectPr>

</xml_diff>